<commit_message>
feat: Implement primitive analysis and scene graph for PDF rendering
- Add PrimitiveBuilder to construct primitive objects from PDF graphics elements.
- Introduce PrimitiveModel to define various primitive types and their properties.
- Create ReadingOrderEngine to analyze reading order and structure of text in PDF.
- Develop SceneGraphEngine to build a scene graph representation of PDF pages.
- Implement SemanticLayoutEngine for semantic layout of PDF content.
- Add TextReconstructionEngine to reconstruct text from reading lines and paragraphs.
- Introduce XObjectResolver to resolve XObjects in PDF documents.
- Create PdfDebugOverlay for debugging visual representation of PDF elements.
- Implement MatrixEngine for matrix transformations in graphics rendering.
</commit_message>
<xml_diff>
--- a/tests/Canvas.Export.Tests/Fidelity/artifacts/latest/links-and-note/word.docx
+++ b/tests/Canvas.Export.Tests/Fidelity/artifacts/latest/links-and-note/word.docx
@@ -66,7 +66,7 @@
         <w:spacing w:before="480"/>
         <w:ind w:left="1040"/>
       </w:pPr>
-      <w:hyperlink xmlns:r="http://schemas.openxmlformats.org/officeDocument/2006/relationships" r:id="Rfc7e34b1ef644031">
+      <w:hyperlink xmlns:r="http://schemas.openxmlformats.org/officeDocument/2006/relationships" r:id="Rae169d7404024990">
         <w:r>
           <w:rPr>
             <w:color w:val="2563EB"/>
@@ -83,7 +83,7 @@
         <w:spacing w:before="160"/>
         <w:ind w:left="1040"/>
       </w:pPr>
-      <w:hyperlink xmlns:r="http://schemas.openxmlformats.org/officeDocument/2006/relationships" r:id="R3292c98c29384d3b">
+      <w:hyperlink xmlns:r="http://schemas.openxmlformats.org/officeDocument/2006/relationships" r:id="R9b3c11e22b9349fa">
         <w:r>
           <w:rPr>
             <w:color w:val="2563EB"/>

</xml_diff>

<commit_message>
feat: add LanguageTabBar and LocalizedPropertiesPanel components for language selection and localization management
</commit_message>
<xml_diff>
--- a/tests/Canvas.Export.Tests/Fidelity/artifacts/latest/links-and-note/word.docx
+++ b/tests/Canvas.Export.Tests/Fidelity/artifacts/latest/links-and-note/word.docx
@@ -66,7 +66,7 @@
         <w:spacing w:before="480"/>
         <w:ind w:left="1040"/>
       </w:pPr>
-      <w:hyperlink xmlns:r="http://schemas.openxmlformats.org/officeDocument/2006/relationships" r:id="Rae169d7404024990">
+      <w:hyperlink xmlns:r="http://schemas.openxmlformats.org/officeDocument/2006/relationships" r:id="R3756743d5e5a4260">
         <w:r>
           <w:rPr>
             <w:color w:val="2563EB"/>
@@ -83,7 +83,7 @@
         <w:spacing w:before="160"/>
         <w:ind w:left="1040"/>
       </w:pPr>
-      <w:hyperlink xmlns:r="http://schemas.openxmlformats.org/officeDocument/2006/relationships" r:id="R9b3c11e22b9349fa">
+      <w:hyperlink xmlns:r="http://schemas.openxmlformats.org/officeDocument/2006/relationships" r:id="R6b92b56935db49b9">
         <w:r>
           <w:rPr>
             <w:color w:val="2563EB"/>

</xml_diff>

<commit_message>
Update Canvas Export Tests and Infrastructure
- Updated various binary files in the Canvas.Infrastructure.Word project, including DLLs, PDBs, and source link JSON.
- Modified multiple test artifacts in Canvas.Export.Tests, including images and PDF files for fidelity checks.
- Added new tests for language overrides in PDF generation, ensuring proper substitution of localized properties.
- Enhanced performance metrics in the word-export performance test, reflecting updated memory usage statistics.
- Updated references and assembly caches for the Canvas.Export.Tests project to ensure compatibility with recent changes.
</commit_message>
<xml_diff>
--- a/tests/Canvas.Export.Tests/Fidelity/artifacts/latest/links-and-note/word.docx
+++ b/tests/Canvas.Export.Tests/Fidelity/artifacts/latest/links-and-note/word.docx
@@ -66,7 +66,7 @@
         <w:spacing w:before="480"/>
         <w:ind w:left="1040"/>
       </w:pPr>
-      <w:hyperlink xmlns:r="http://schemas.openxmlformats.org/officeDocument/2006/relationships" r:id="R3756743d5e5a4260">
+      <w:hyperlink xmlns:r="http://schemas.openxmlformats.org/officeDocument/2006/relationships" r:id="R62bdea49014b4fbf">
         <w:r>
           <w:rPr>
             <w:color w:val="2563EB"/>
@@ -83,7 +83,7 @@
         <w:spacing w:before="160"/>
         <w:ind w:left="1040"/>
       </w:pPr>
-      <w:hyperlink xmlns:r="http://schemas.openxmlformats.org/officeDocument/2006/relationships" r:id="R6b92b56935db49b9">
+      <w:hyperlink xmlns:r="http://schemas.openxmlformats.org/officeDocument/2006/relationships" r:id="R01cd1739bb9a4b84">
         <w:r>
           <w:rPr>
             <w:color w:val="2563EB"/>

</xml_diff>

<commit_message>
Add unit tests for ShapeDetector and TextEngine functionality
- Implement ShapeDetectorTests to validate Sobel edge detection, horizontal segment detection, and rectangle assembly.
- Create TextEngineTests to cover text rendering, connected component labeling, candidate filtering, line assembly, and full analysis pipeline.
- Ensure tests check for expected outputs and edge cases, including handling of ambiguous glyphs and decorative symbols.
</commit_message>
<xml_diff>
--- a/tests/Canvas.Export.Tests/Fidelity/artifacts/latest/links-and-note/word.docx
+++ b/tests/Canvas.Export.Tests/Fidelity/artifacts/latest/links-and-note/word.docx
@@ -66,7 +66,7 @@
         <w:spacing w:before="480"/>
         <w:ind w:left="1040"/>
       </w:pPr>
-      <w:hyperlink xmlns:r="http://schemas.openxmlformats.org/officeDocument/2006/relationships" r:id="R62bdea49014b4fbf">
+      <w:hyperlink xmlns:r="http://schemas.openxmlformats.org/officeDocument/2006/relationships" r:id="R1f610de0348347b1">
         <w:r>
           <w:rPr>
             <w:color w:val="2563EB"/>
@@ -83,7 +83,7 @@
         <w:spacing w:before="160"/>
         <w:ind w:left="1040"/>
       </w:pPr>
-      <w:hyperlink xmlns:r="http://schemas.openxmlformats.org/officeDocument/2006/relationships" r:id="R01cd1739bb9a4b84">
+      <w:hyperlink xmlns:r="http://schemas.openxmlformats.org/officeDocument/2006/relationships" r:id="Rf45e4424fcfe4d3c">
         <w:r>
           <w:rPr>
             <w:color w:val="2563EB"/>

</xml_diff>

<commit_message>
feat: Enhance image analysis features in SimpleCanvas
- Added new types for GlyphDiagnostic and ImageAnalysisDiagnostics to improve type safety.
- Implemented functions to retrieve glyph diagnostics and image analysis diagnostics.
- Introduced formatting functions for percentages and numbers.
- Enhanced SimpleCanvas component to display image analysis diagnostics, including glyph counts and low confidence metrics.
- Added UI elements for displaying image analysis results and glyph diagnostics.
- Updated styles for new UI components related to image analysis.
- Introduced GoogleFontCss class to manage Google Fonts used in the editor, ensuring consistent font rendering in exports.
- Refactored file import functionality in IndexPage and TemplatePage to streamline user experience.
</commit_message>
<xml_diff>
--- a/tests/Canvas.Export.Tests/Fidelity/artifacts/latest/links-and-note/word.docx
+++ b/tests/Canvas.Export.Tests/Fidelity/artifacts/latest/links-and-note/word.docx
@@ -66,7 +66,7 @@
         <w:spacing w:before="480"/>
         <w:ind w:left="1040"/>
       </w:pPr>
-      <w:hyperlink xmlns:r="http://schemas.openxmlformats.org/officeDocument/2006/relationships" r:id="R1f610de0348347b1">
+      <w:hyperlink xmlns:r="http://schemas.openxmlformats.org/officeDocument/2006/relationships" r:id="R3cb840e2249749fd">
         <w:r>
           <w:rPr>
             <w:color w:val="2563EB"/>
@@ -83,7 +83,7 @@
         <w:spacing w:before="160"/>
         <w:ind w:left="1040"/>
       </w:pPr>
-      <w:hyperlink xmlns:r="http://schemas.openxmlformats.org/officeDocument/2006/relationships" r:id="Rf45e4424fcfe4d3c">
+      <w:hyperlink xmlns:r="http://schemas.openxmlformats.org/officeDocument/2006/relationships" r:id="Rba482be2b38940f3">
         <w:r>
           <w:rPr>
             <w:color w:val="2563EB"/>

</xml_diff>